<commit_message>
feat: enforce model template comments and reuse existing diagrams
</commit_message>
<xml_diff>
--- a/skills/ats-kt1-algorithm-docs/assets/模型原理说明-示例.docx
+++ b/skills/ats-kt1-algorithm-docs/assets/模型原理说明-示例.docx
@@ -7300,7 +7300,7 @@
     </ns0:p>
   </ns0:comment>
   <ns0:comment ns0:id="5" ns0:author="ATS课题一" ns0:date="2026-08-04T23:49:00Z" ns0:initials="ATS">
-    <ns0:p ns2:paraId="0E8B3E8F" ns2:textId="77777777" ns0:rsidR="00507487" ns0:rsidRDefault="00507487">
+    <ns0:p ns2:paraId="25230EA3" ns2:textId="16B25E0C" ns0:rsidR="009D50F4" ns0:rsidRDefault="00507487">
       <ns0:pPr>
         <ns0:pStyle ns0:val="a3"/>
       </ns0:pPr>
@@ -7310,6 +7310,25 @@
         </ns0:rPr>
         <ns0:annotationRef/>
       </ns0:r>
+      <ns0:r ns0:rsidR="009D50F4">
+        <ns0:rPr>
+          <ns0:rFonts ns0:hint="eastAsia"/>
+        </ns0:rPr>
+        <ns0:t>写得稍微详细一些，可以结合公式和符号进行介绍，不要只写一两句话。</ns0:t>
+      </ns0:r>
+    </ns0:p>
+    <ns0:p ns2:paraId="398BF69D" ns2:textId="77777777" ns0:rsidR="009D50F4" ns0:rsidRPr="009D50F4" ns0:rsidRDefault="009D50F4">
+      <ns0:pPr>
+        <ns0:pStyle ns0:val="a3"/>
+        <ns0:rPr>
+          <ns0:rFonts ns0:hint="eastAsia"/>
+        </ns0:rPr>
+      </ns0:pPr>
+    </ns0:p>
+    <ns0:p ns2:paraId="0E8B3E8F" ns2:textId="38295808" ns0:rsidR="00507487" ns0:rsidRDefault="00507487">
+      <ns0:pPr>
+        <ns0:pStyle ns0:val="a3"/>
+      </ns0:pPr>
       <ns0:r>
         <ns0:rPr>
           <ns0:rFonts ns0:hint="eastAsia"/>
@@ -7505,9 +7524,6 @@
     <ns0:p ns2:paraId="15B80049" ns2:textId="6503D843" ns0:rsidR="00D65857" ns0:rsidRDefault="00D65857">
       <ns0:pPr>
         <ns0:pStyle ns0:val="a3"/>
-        <ns0:rPr>
-          <ns0:rFonts ns0:hint="eastAsia"/>
-        </ns0:rPr>
       </ns0:pPr>
       <ns0:r>
         <ns0:rPr>
@@ -7519,9 +7535,6 @@
     <ns0:p ns2:paraId="6AF7F7A8" ns2:textId="72F1EF3D" ns0:rsidR="00D65857" ns0:rsidRDefault="00D65857">
       <ns0:pPr>
         <ns0:pStyle ns0:val="a3"/>
-        <ns0:rPr>
-          <ns0:rFonts ns0:hint="eastAsia"/>
-        </ns0:rPr>
       </ns0:pPr>
     </ns0:p>
   </ns0:comment>
@@ -7562,9 +7575,6 @@
     <ns0:p ns2:paraId="7D8023A1" ns2:textId="20C2EA0A" ns0:rsidR="00D65857" ns0:rsidRDefault="00D65857" ns0:rsidP="00C44CB8">
       <ns0:pPr>
         <ns0:pStyle ns0:val="a3"/>
-        <ns0:rPr>
-          <ns0:rFonts ns0:hint="eastAsia"/>
-        </ns0:rPr>
       </ns0:pPr>
       <ns0:r>
         <ns0:rPr>

</xml_diff>

<commit_message>
feat: map collaboration scenes into model docs
</commit_message>
<xml_diff>
--- a/skills/ats-kt1-algorithm-docs/assets/模型原理说明-示例.docx
+++ b/skills/ats-kt1-algorithm-docs/assets/模型原理说明-示例.docx
@@ -5719,16 +5719,14 @@
                 <w:kern w:val="0"/>
               </w:rPr>
             </w:pPr>
-            <w:bookmarkStart w:id="1" w:name="_Hlk236779734"/>
-            <w:r>
-              <w:rPr>
-                <w:rFonts w:ascii="仿宋" w:eastAsia="仿宋" w:hAnsi="仿宋" w:hint="eastAsia"/>
-                <w:kern w:val="0"/>
-                <w:sz w:val="24"/>
-              </w:rPr>
-              <w:t>上游接口模型编号</w:t>
-            </w:r>
-            <w:bookmarkEnd w:id="1"/>
+            <w:r>
+              <w:rPr>
+                <w:rFonts w:ascii="仿宋" w:eastAsia="仿宋" w:hAnsi="仿宋"/>
+                <w:kern w:val="0"/>
+                <w:sz w:val="24"/>
+              </w:rPr>
+              <w:t>支持的协同场景</w:t>
+            </w:r>
           </w:p>
         </w:tc>
         <w:tc>
@@ -5746,123 +5744,55 @@
             <w:pPr>
               <w:jc w:val="center"/>
               <w:rPr>
-                <w:kern w:val="0"/>
-              </w:rPr>
-            </w:pPr>
-          </w:p>
-        </w:tc>
-      </w:tr>
-      <w:tr>
-        <w:tc>
-          <w:tcPr>
-            <w:tcW w:w="2689" w:type="dxa"/>
-            <w:shd w:val="clear" w:color="auto" w:fill="D9D9D9" w:themeFill="background1" w:themeFillShade="D9"/>
-            <w:tcMar>
-              <w:top w:w="0" w:type="dxa"/>
-              <w:left w:w="108" w:type="dxa"/>
-              <w:bottom w:w="0" w:type="dxa"/>
-              <w:right w:w="108" w:type="dxa"/>
-            </w:tcMar>
-          </w:tcPr>
-          <w:p>
-            <w:pPr>
-              <w:jc w:val="center"/>
-              <w:rPr>
-                <w:kern w:val="0"/>
-              </w:rPr>
-            </w:pPr>
-            <w:bookmarkStart w:id="2" w:name="_Hlk236779737"/>
-            <w:r>
-              <w:rPr>
-                <w:rFonts w:ascii="仿宋" w:eastAsia="仿宋" w:hAnsi="仿宋" w:hint="eastAsia"/>
-                <w:kern w:val="0"/>
-                <w:sz w:val="24"/>
-              </w:rPr>
-              <w:t>下游接口模型编号</w:t>
-            </w:r>
-            <w:bookmarkEnd w:id="2"/>
-          </w:p>
-        </w:tc>
-        <w:tc>
-          <w:tcPr>
-            <w:tcW w:w="5607" w:type="dxa"/>
-            <w:gridSpan w:val="2"/>
-            <w:tcMar>
-              <w:top w:w="0" w:type="dxa"/>
-              <w:left w:w="108" w:type="dxa"/>
-              <w:bottom w:w="0" w:type="dxa"/>
-              <w:right w:w="108" w:type="dxa"/>
-            </w:tcMar>
-          </w:tcPr>
-          <w:p>
-            <w:pPr>
-              <w:jc w:val="center"/>
-              <w:rPr>
-                <w:kern w:val="0"/>
-              </w:rPr>
-            </w:pPr>
-          </w:p>
-        </w:tc>
-      </w:tr>
-      <w:tr>
-        <w:tc>
-          <w:tcPr>
-            <w:tcW w:w="2689" w:type="dxa"/>
-            <w:shd w:val="clear" w:color="auto" w:fill="D9D9D9" w:themeFill="background1" w:themeFillShade="D9"/>
-            <w:tcMar>
-              <w:top w:w="0" w:type="dxa"/>
-              <w:left w:w="108" w:type="dxa"/>
-              <w:bottom w:w="0" w:type="dxa"/>
-              <w:right w:w="108" w:type="dxa"/>
-            </w:tcMar>
-          </w:tcPr>
-          <w:p>
-            <w:pPr>
-              <w:jc w:val="center"/>
-              <w:rPr>
-                <w:kern w:val="0"/>
-              </w:rPr>
-            </w:pPr>
-            <w:bookmarkStart w:id="3" w:name="_Hlk236779740"/>
-            <w:commentRangeStart w:id="4"/>
-            <w:r>
-              <w:rPr>
-                <w:rFonts w:ascii="仿宋" w:eastAsia="仿宋" w:hAnsi="仿宋" w:hint="eastAsia"/>
-                <w:kern w:val="0"/>
-                <w:sz w:val="24"/>
-              </w:rPr>
-              <w:t>交付时间</w:t>
-            </w:r>
-            <w:bookmarkEnd w:id="3"/>
-            <w:commentRangeEnd w:id="4"/>
-            <w:r>
-              <w:rPr>
-                <w:rStyle w:val="ae"/>
-                <w:kern w:val="0"/>
-                <w:szCs w:val="22"/>
-              </w:rPr>
-              <w:commentReference w:id="4"/>
-            </w:r>
-          </w:p>
-        </w:tc>
-        <w:tc>
-          <w:tcPr>
-            <w:tcW w:w="5607" w:type="dxa"/>
-            <w:gridSpan w:val="2"/>
-            <w:tcMar>
-              <w:top w:w="0" w:type="dxa"/>
-              <w:left w:w="108" w:type="dxa"/>
-              <w:bottom w:w="0" w:type="dxa"/>
-              <w:right w:w="108" w:type="dxa"/>
-            </w:tcMar>
-          </w:tcPr>
-          <w:p>
-            <w:pPr>
-              <w:jc w:val="center"/>
-              <w:rPr>
-                <w:kern w:val="0"/>
-              </w:rPr>
-            </w:pPr>
+                <w:rFonts w:hint="eastAsia"/>
+                <w:kern w:val="0"/>
+              </w:rPr>
+            </w:pPr>
+            <w:r>
+              <w:rPr>
+                <w:kern w:val="0"/>
+              </w:rPr>
+              <w:t>车端-低级别自动驾驶（&lt;L3）</w:t>
+            </w:r>
+            <w:r>
+              <w:rPr>
+                <w:rFonts w:hint="eastAsia"/>
+                <w:kern w:val="0"/>
+              </w:rPr>
+              <w:t>，</w:t>
+            </w:r>
+            <w:r>
+              <w:rPr>
+                <w:kern w:val="0"/>
+              </w:rPr>
+              <w:t>车端-高级别自动驾驶（≥L3）</w:t>
+            </w:r>
+            <w:r>
+              <w:rPr>
+                <w:rFonts w:hint="eastAsia"/>
+                <w:kern w:val="0"/>
+              </w:rPr>
+              <w:t>，</w:t>
+            </w:r>
+            <w:r>
+              <w:rPr>
+                <w:kern w:val="0"/>
+              </w:rPr>
+              <w:t>车路协同</w:t>
+            </w:r>
+            <w:r>
+              <w:rPr>
+                <w:rFonts w:hint="eastAsia"/>
+                <w:kern w:val="0"/>
+              </w:rPr>
+              <w:t>，</w:t>
+            </w:r>
+            <w:r>
+              <w:rPr>
+                <w:kern w:val="0"/>
+              </w:rPr>
+              <w:t>端边云协同</w:t>
+            </w:r>
           </w:p>
         </w:tc>
       </w:tr>
@@ -5957,7 +5887,7 @@
           <w:szCs w:val="44"/>
         </w:rPr>
       </w:pPr>
-      <w:commentRangeStart w:id="5"/>
+      <w:commentRangeStart w:id="1"/>
       <w:r>
         <w:rPr>
           <w:rFonts w:ascii="仿宋" w:eastAsia="仿宋" w:hAnsi="仿宋" w:cs="Times New Roman" w:hint="eastAsia"/>
@@ -5968,7 +5898,7 @@
         </w:rPr>
         <w:t>2 算法模型简介</w:t>
       </w:r>
-      <w:commentRangeEnd w:id="5"/>
+      <w:commentRangeEnd w:id="1"/>
       <w:r>
         <w:rPr>
           <w:rStyle w:val="ae"/>
@@ -5978,7 +5908,7 @@
           <w:sz w:val="32"/>
           <w:szCs w:val="44"/>
         </w:rPr>
-        <w:commentReference w:id="5"/>
+        <w:commentReference w:id="1"/>
       </w:r>
     </w:p>
     <w:p>
@@ -7102,7 +7032,7 @@
           <w:szCs w:val="28"/>
         </w:rPr>
       </w:pPr>
-      <w:commentRangeStart w:id="6"/>
+      <w:commentRangeStart w:id="2"/>
       <w:r>
         <w:rPr>
           <w:rFonts w:ascii="仿宋" w:eastAsia="仿宋" w:hAnsi="仿宋" w:cs="Times New Roman" w:hint="eastAsia"/>
@@ -7123,7 +7053,7 @@
         </w:rPr>
         <w:t>图</w:t>
       </w:r>
-      <w:commentRangeEnd w:id="6"/>
+      <w:commentRangeEnd w:id="2"/>
       <w:r>
         <w:rPr>
           <w:rStyle w:val="ae"/>
@@ -7133,7 +7063,7 @@
           <w:sz w:val="24"/>
           <w:szCs w:val="28"/>
         </w:rPr>
-        <w:commentReference w:id="6"/>
+        <w:commentReference w:id="2"/>
       </w:r>
     </w:p>
     <w:p>
@@ -7163,7 +7093,8 @@
         <w:lastRenderedPageBreak/>
         <w:t xml:space="preserve">3 </w:t>
       </w:r>
-      <w:commentRangeStart w:id="7"/>
+      <w:bookmarkStart w:id="3" w:name="OLE_LINK2"/>
+      <w:commentRangeStart w:id="4"/>
       <w:r>
         <w:rPr>
           <w:rFonts w:ascii="仿宋" w:eastAsia="仿宋" w:hAnsi="仿宋" w:cs="Times New Roman" w:hint="eastAsia"/>
@@ -7174,7 +7105,8 @@
         </w:rPr>
         <w:t>算法模型流程图</w:t>
       </w:r>
-      <w:commentRangeEnd w:id="7"/>
+      <w:bookmarkEnd w:id="3"/>
+      <w:commentRangeEnd w:id="4"/>
       <w:r>
         <w:rPr>
           <w:rStyle w:val="ae"/>
@@ -7184,7 +7116,7 @@
           <w:sz w:val="32"/>
           <w:szCs w:val="44"/>
         </w:rPr>
-        <w:commentReference w:id="7"/>
+        <w:commentReference w:id="4"/>
       </w:r>
     </w:p>
     <w:p>
@@ -7263,43 +7195,7 @@
 
 <file path=word/comments.xml><?xml version="1.0" encoding="utf-8"?>
 <ns0:comments xmlns:ns0="http://schemas.openxmlformats.org/wordprocessingml/2006/main" xmlns:ns1="http://schemas.openxmlformats.org/markup-compatibility/2006" xmlns:ns2="http://schemas.microsoft.com/office/word/2010/wordml" ns1:Ignorable="w14 w15 w16se w16cid w16 w16cex w16sdtdh w16sdtfl w16du wp14">
-  <ns0:comment ns0:id="4" ns0:author="ATS课题一" ns0:date="2026-08-04T23:48:00Z" ns0:initials="ATS">
-    <ns0:p ns2:paraId="62E65F60" ns2:textId="77777777" ns0:rsidR="00507487" ns0:rsidRDefault="00507487">
-      <ns0:pPr>
-        <ns0:pStyle ns0:val="a3"/>
-        <ns0:rPr>
-          <ns0:rFonts ns0:ascii="仿宋" ns0:eastAsia="仿宋" ns0:hAnsi="仿宋"/>
-          <ns0:kern ns0:val="0"/>
-        </ns0:rPr>
-      </ns0:pPr>
-      <ns0:r>
-        <ns0:rPr>
-          <ns0:rStyle ns0:val="ae"/>
-        </ns0:rPr>
-        <ns0:annotationRef/>
-      </ns0:r>
-      <ns0:r>
-        <ns0:rPr>
-          <ns0:rFonts ns0:ascii="仿宋" ns0:eastAsia="仿宋" ns0:hAnsi="仿宋" ns0:hint="eastAsia"/>
-          <ns0:kern ns0:val="0"/>
-        </ns0:rPr>
-        <ns0:t>上游接口模型编号  下游接口模型编号   交付时间</ns0:t>
-      </ns0:r>
-    </ns0:p>
-    <ns0:p ns2:paraId="73AE777B" ns2:textId="4DB30362" ns0:rsidR="00507487" ns0:rsidRDefault="00507487">
-      <ns0:pPr>
-        <ns0:pStyle ns0:val="a3"/>
-      </ns0:pPr>
-      <ns0:r>
-        <ns0:rPr>
-          <ns0:rFonts ns0:ascii="仿宋" ns0:eastAsia="仿宋" ns0:hAnsi="仿宋" ns0:hint="eastAsia"/>
-          <ns0:kern ns0:val="0"/>
-        </ns0:rPr>
-        <ns0:t xml:space="preserve">  空着不用填</ns0:t>
-      </ns0:r>
-    </ns0:p>
-  </ns0:comment>
-  <ns0:comment ns0:id="5" ns0:author="ATS课题一" ns0:date="2026-08-04T23:49:00Z" ns0:initials="ATS">
+  <ns0:comment ns0:id="1" ns0:author="ATS课题一" ns0:date="2026-08-04T23:49:00Z" ns0:initials="ATS">
     <ns0:p ns2:paraId="25230EA3" ns2:textId="16B25E0C" ns0:rsidR="009D50F4" ns0:rsidRDefault="00507487">
       <ns0:pPr>
         <ns0:pStyle ns0:val="a3"/>
@@ -7320,9 +7216,6 @@
     <ns0:p ns2:paraId="398BF69D" ns2:textId="77777777" ns0:rsidR="009D50F4" ns0:rsidRPr="009D50F4" ns0:rsidRDefault="009D50F4">
       <ns0:pPr>
         <ns0:pStyle ns0:val="a3"/>
-        <ns0:rPr>
-          <ns0:rFonts ns0:hint="eastAsia"/>
-        </ns0:rPr>
       </ns0:pPr>
     </ns0:p>
     <ns0:p ns2:paraId="0E8B3E8F" ns2:textId="38295808" ns0:rsidR="00507487" ns0:rsidRDefault="00507487">
@@ -7487,7 +7380,7 @@
       </ns0:pPr>
     </ns0:p>
   </ns0:comment>
-  <ns0:comment ns0:id="6" ns0:author="ATS课题一" ns0:date="2026-08-04T23:40:00Z" ns0:initials="ATS">
+  <ns0:comment ns0:id="2" ns0:author="ATS课题一" ns0:date="2026-08-04T23:40:00Z" ns0:initials="ATS">
     <ns0:p ns2:paraId="670E1715" ns2:textId="77777777" ns0:rsidR="00C333F1" ns0:rsidRDefault="00C333F1">
       <ns0:pPr>
         <ns0:pStyle ns0:val="a3"/>
@@ -7538,7 +7431,7 @@
       </ns0:pPr>
     </ns0:p>
   </ns0:comment>
-  <ns0:comment ns0:id="7" ns0:author="ATS课题一" ns0:date="2026-08-04T23:50:00Z" ns0:initials="ATS">
+  <ns0:comment ns0:id="4" ns0:author="ATS课题一" ns0:date="2026-08-04T23:50:00Z" ns0:initials="ATS">
     <ns0:p ns2:paraId="39A00104" ns2:textId="77777777" ns0:rsidR="00C44CB8" ns0:rsidRDefault="00C44CB8" ns0:rsidP="00C44CB8">
       <ns0:pPr>
         <ns0:pStyle ns0:val="a3"/>
@@ -7589,7 +7482,6 @@
 
 <file path=word/commentsExtended.xml><?xml version="1.0" encoding="utf-8"?>
 <w15:commentsEx xmlns:wpc="http://schemas.microsoft.com/office/word/2010/wordprocessingCanvas" xmlns:cx="http://schemas.microsoft.com/office/drawing/2014/chartex" xmlns:cx1="http://schemas.microsoft.com/office/drawing/2015/9/8/chartex" xmlns:cx2="http://schemas.microsoft.com/office/drawing/2015/10/21/chartex" xmlns:cx3="http://schemas.microsoft.com/office/drawing/2016/5/9/chartex" xmlns:cx4="http://schemas.microsoft.com/office/drawing/2016/5/10/chartex" xmlns:cx5="http://schemas.microsoft.com/office/drawing/2016/5/11/chartex" xmlns:cx6="http://schemas.microsoft.com/office/drawing/2016/5/12/chartex" xmlns:cx7="http://schemas.microsoft.com/office/drawing/2016/5/13/chartex" xmlns:cx8="http://schemas.microsoft.com/office/drawing/2016/5/14/chartex" xmlns:mc="http://schemas.openxmlformats.org/markup-compatibility/2006" xmlns:m="http://schemas.openxmlformats.org/officeDocument/2006/math" xmlns:aink="http://schemas.microsoft.com/office/drawing/2016/ink" xmlns:am3d="http://schemas.microsoft.com/office/drawing/2017/model3d" xmlns:oel="http://schemas.microsoft.com/office/2019/extlst" xmlns:r="http://schemas.openxmlformats.org/officeDocument/2006/relationships" xmlns:wp14="http://schemas.microsoft.com/office/word/2010/wordprocessingDrawing" xmlns:wp="http://schemas.openxmlformats.org/drawingml/2006/wordprocessingDrawing" xmlns:wpg="http://schemas.microsoft.com/office/word/2010/wordprocessingGroup" xmlns:wpi="http://schemas.microsoft.com/office/word/2010/wordprocessingInk" xmlns:wps="http://schemas.microsoft.com/office/word/2010/wordprocessingShape" xmlns:o="urn:schemas-microsoft-com:office:office" xmlns:v="urn:schemas-microsoft-com:vml" xmlns:w10="urn:schemas-microsoft-com:office:word" xmlns:w="http://schemas.openxmlformats.org/wordprocessingml/2006/main" xmlns:w14="http://schemas.microsoft.com/office/word/2010/wordml" xmlns:w15="http://schemas.microsoft.com/office/word/2012/wordml" xmlns:w16cex="http://schemas.microsoft.com/office/word/2018/wordml/cex" xmlns:w16cid="http://schemas.microsoft.com/office/word/2016/wordml/cid" xmlns:w16="http://schemas.microsoft.com/office/word/2018/wordml" xmlns:w16sdtdh="http://schemas.microsoft.com/office/word/2020/wordml/sdtdatahash" xmlns:w16sdtfl="http://schemas.microsoft.com/office/word/2024/wordml/sdtformatlock" xmlns:w16se="http://schemas.microsoft.com/office/word/2015/wordml/symex" xmlns:w16du="http://schemas.microsoft.com/office/word/2023/wordml/word16du" xmlns:wne="http://schemas.microsoft.com/office/word/2006/wordml" mc:Ignorable="w14 w15 w16se w16cid w16 w16cex w16sdtdh w16sdtfl w16du wp14">
-  <w15:commentEx w15:paraId="73AE777B" w15:done="0"/>
   <w15:commentEx w15:paraId="4673DB0A" w15:done="0"/>
   <w15:commentEx w15:paraId="6AF7F7A8" w15:done="0"/>
   <w15:commentEx w15:paraId="7D8023A1" w15:done="0"/>
@@ -7598,7 +7490,6 @@
 
 <file path=word/commentsExtensible.xml><?xml version="1.0" encoding="utf-8"?>
 <w16cex:commentsExtensible xmlns:wpc="http://schemas.microsoft.com/office/word/2010/wordprocessingCanvas" xmlns:cx="http://schemas.microsoft.com/office/drawing/2014/chartex" xmlns:cx1="http://schemas.microsoft.com/office/drawing/2015/9/8/chartex" xmlns:cx2="http://schemas.microsoft.com/office/drawing/2015/10/21/chartex" xmlns:cx3="http://schemas.microsoft.com/office/drawing/2016/5/9/chartex" xmlns:cx4="http://schemas.microsoft.com/office/drawing/2016/5/10/chartex" xmlns:cx5="http://schemas.microsoft.com/office/drawing/2016/5/11/chartex" xmlns:cx6="http://schemas.microsoft.com/office/drawing/2016/5/12/chartex" xmlns:cx7="http://schemas.microsoft.com/office/drawing/2016/5/13/chartex" xmlns:cx8="http://schemas.microsoft.com/office/drawing/2016/5/14/chartex" xmlns:cr="http://schemas.microsoft.com/office/comments/2020/reactions" xmlns:mc="http://schemas.openxmlformats.org/markup-compatibility/2006" xmlns:m="http://schemas.openxmlformats.org/officeDocument/2006/math" xmlns:aink="http://schemas.microsoft.com/office/drawing/2016/ink" xmlns:am3d="http://schemas.microsoft.com/office/drawing/2017/model3d" xmlns:oel="http://schemas.microsoft.com/office/2019/extlst" xmlns:r="http://schemas.openxmlformats.org/officeDocument/2006/relationships" xmlns:wp14="http://schemas.microsoft.com/office/word/2010/wordprocessingDrawing" xmlns:wp="http://schemas.openxmlformats.org/drawingml/2006/wordprocessingDrawing" xmlns:wpg="http://schemas.microsoft.com/office/word/2010/wordprocessingGroup" xmlns:wpi="http://schemas.microsoft.com/office/word/2010/wordprocessingInk" xmlns:wps="http://schemas.microsoft.com/office/word/2010/wordprocessingShape" xmlns:o="urn:schemas-microsoft-com:office:office" xmlns:v="urn:schemas-microsoft-com:vml" xmlns:w10="urn:schemas-microsoft-com:office:word" xmlns:w="http://schemas.openxmlformats.org/wordprocessingml/2006/main" xmlns:w14="http://schemas.microsoft.com/office/word/2010/wordml" xmlns:w15="http://schemas.microsoft.com/office/word/2012/wordml" xmlns:w16cex="http://schemas.microsoft.com/office/word/2018/wordml/cex" xmlns:w16cid="http://schemas.microsoft.com/office/word/2016/wordml/cid" xmlns:w16="http://schemas.microsoft.com/office/word/2018/wordml" xmlns:w16sdtdh="http://schemas.microsoft.com/office/word/2020/wordml/sdtdatahash" xmlns:w16sdtfl="http://schemas.microsoft.com/office/word/2024/wordml/sdtformatlock" xmlns:w16se="http://schemas.microsoft.com/office/word/2015/wordml/symex" xmlns:w16du="http://schemas.microsoft.com/office/word/2023/wordml/word16du" xmlns:wne="http://schemas.microsoft.com/office/word/2006/wordml" mc:Ignorable="w14 w15 w16se w16cid w16 w16cex w16sdtdh w16sdtfl cr w16du wp14">
-  <w16cex:commentExtensible w16cex:durableId="12D32B4E" w16cex:dateUtc="2026-08-04T15:48:00Z"/>
   <w16cex:commentExtensible w16cex:durableId="212AC8B1" w16cex:dateUtc="2026-08-04T15:49:00Z"/>
   <w16cex:commentExtensible w16cex:durableId="06227884" w16cex:dateUtc="2026-08-04T15:40:00Z"/>
   <w16cex:commentExtensible w16cex:durableId="0FC2630A" w16cex:dateUtc="2026-08-04T15:50:00Z"/>
@@ -7607,7 +7498,6 @@
 
 <file path=word/commentsIds.xml><?xml version="1.0" encoding="utf-8"?>
 <w16cid:commentsIds xmlns:wpc="http://schemas.microsoft.com/office/word/2010/wordprocessingCanvas" xmlns:cx="http://schemas.microsoft.com/office/drawing/2014/chartex" xmlns:cx1="http://schemas.microsoft.com/office/drawing/2015/9/8/chartex" xmlns:cx2="http://schemas.microsoft.com/office/drawing/2015/10/21/chartex" xmlns:cx3="http://schemas.microsoft.com/office/drawing/2016/5/9/chartex" xmlns:cx4="http://schemas.microsoft.com/office/drawing/2016/5/10/chartex" xmlns:cx5="http://schemas.microsoft.com/office/drawing/2016/5/11/chartex" xmlns:cx6="http://schemas.microsoft.com/office/drawing/2016/5/12/chartex" xmlns:cx7="http://schemas.microsoft.com/office/drawing/2016/5/13/chartex" xmlns:cx8="http://schemas.microsoft.com/office/drawing/2016/5/14/chartex" xmlns:mc="http://schemas.openxmlformats.org/markup-compatibility/2006" xmlns:m="http://schemas.openxmlformats.org/officeDocument/2006/math" xmlns:aink="http://schemas.microsoft.com/office/drawing/2016/ink" xmlns:am3d="http://schemas.microsoft.com/office/drawing/2017/model3d" xmlns:oel="http://schemas.microsoft.com/office/2019/extlst" xmlns:r="http://schemas.openxmlformats.org/officeDocument/2006/relationships" xmlns:wp14="http://schemas.microsoft.com/office/word/2010/wordprocessingDrawing" xmlns:wp="http://schemas.openxmlformats.org/drawingml/2006/wordprocessingDrawing" xmlns:wpg="http://schemas.microsoft.com/office/word/2010/wordprocessingGroup" xmlns:wpi="http://schemas.microsoft.com/office/word/2010/wordprocessingInk" xmlns:wps="http://schemas.microsoft.com/office/word/2010/wordprocessingShape" xmlns:o="urn:schemas-microsoft-com:office:office" xmlns:v="urn:schemas-microsoft-com:vml" xmlns:w10="urn:schemas-microsoft-com:office:word" xmlns:w="http://schemas.openxmlformats.org/wordprocessingml/2006/main" xmlns:w14="http://schemas.microsoft.com/office/word/2010/wordml" xmlns:w15="http://schemas.microsoft.com/office/word/2012/wordml" xmlns:w16cex="http://schemas.microsoft.com/office/word/2018/wordml/cex" xmlns:w16cid="http://schemas.microsoft.com/office/word/2016/wordml/cid" xmlns:w16="http://schemas.microsoft.com/office/word/2018/wordml" xmlns:w16sdtdh="http://schemas.microsoft.com/office/word/2020/wordml/sdtdatahash" xmlns:w16sdtfl="http://schemas.microsoft.com/office/word/2024/wordml/sdtformatlock" xmlns:w16se="http://schemas.microsoft.com/office/word/2015/wordml/symex" xmlns:w16du="http://schemas.microsoft.com/office/word/2023/wordml/word16du" xmlns:wne="http://schemas.microsoft.com/office/word/2006/wordml" mc:Ignorable="w14 w15 w16se w16cid w16 w16cex w16sdtdh w16sdtfl w16du wp14">
-  <w16cid:commentId w16cid:paraId="73AE777B" w16cid:durableId="12D32B4E"/>
   <w16cid:commentId w16cid:paraId="4673DB0A" w16cid:durableId="212AC8B1"/>
   <w16cid:commentId w16cid:paraId="6AF7F7A8" w16cid:durableId="06227884"/>
   <w16cid:commentId w16cid:paraId="7D8023A1" w16cid:durableId="0FC2630A"/>

</xml_diff>